<commit_message>
configuração inicial das records, classes e repositorys
</commit_message>
<xml_diff>
--- a/Microservices/3SIT - 2023.01 GS (1).docx
+++ b/Microservices/3SIT - 2023.01 GS (1).docx
@@ -15,8 +15,6 @@
           <w:lang w:eastAsia="pt-BR"/>
         </w:rPr>
       </w:pPr>
-      <w:bookmarkStart w:id="0" w:name="_GoBack"/>
-      <w:bookmarkEnd w:id="0"/>
       <w:r>
         <w:rPr>
           <w:rFonts w:ascii="Arial" w:hAnsi="Arial" w:eastAsia="Times New Roman" w:cs="Arial"/>
@@ -750,7 +748,19 @@
           <w:szCs w:val="21"/>
           <w:shd w:val="clear" w:fill="FFFFFF"/>
         </w:rPr>
-        <w:t>. Isso permitirá o acompanhamento do desempenho de cada drone ao longo do tempo.</w:t>
+        <w:t>. Isso permiti</w:t>
+      </w:r>
+      <w:bookmarkStart w:id="0" w:name="_GoBack"/>
+      <w:bookmarkEnd w:id="0"/>
+      <w:r>
+        <w:rPr>
+          <w:rFonts w:ascii="Arial" w:hAnsi="Arial" w:cs="Arial"/>
+          <w:color w:val="202122"/>
+          <w:sz w:val="21"/>
+          <w:szCs w:val="21"/>
+          <w:shd w:val="clear" w:fill="FFFFFF"/>
+        </w:rPr>
+        <w:t>rá o acompanhamento do desempenho de cada drone ao longo do tempo.</w:t>
       </w:r>
     </w:p>
     <w:p>

</xml_diff>

<commit_message>
configuração completa da entidade drona
</commit_message>
<xml_diff>
--- a/Microservices/3SIT - 2023.01 GS (1).docx
+++ b/Microservices/3SIT - 2023.01 GS (1).docx
@@ -748,19 +748,7 @@
           <w:szCs w:val="21"/>
           <w:shd w:val="clear" w:fill="FFFFFF"/>
         </w:rPr>
-        <w:t>. Isso permiti</w:t>
-      </w:r>
-      <w:bookmarkStart w:id="0" w:name="_GoBack"/>
-      <w:bookmarkEnd w:id="0"/>
-      <w:r>
-        <w:rPr>
-          <w:rFonts w:ascii="Arial" w:hAnsi="Arial" w:cs="Arial"/>
-          <w:color w:val="202122"/>
-          <w:sz w:val="21"/>
-          <w:szCs w:val="21"/>
-          <w:shd w:val="clear" w:fill="FFFFFF"/>
-        </w:rPr>
-        <w:t>rá o acompanhamento do desempenho de cada drone ao longo do tempo.</w:t>
+        <w:t>. Isso permitirá o acompanhamento do desempenho de cada drone ao longo do tempo.</w:t>
       </w:r>
     </w:p>
     <w:p>
@@ -3027,7 +3015,19 @@
           <w:szCs w:val="21"/>
           <w:shd w:val="clear" w:fill="FFFFFF"/>
         </w:rPr>
-        <w:t>A sistema deverá possuir a documentação online e dinâmica da API.</w:t>
+        <w:t>A sistema deverá possuir</w:t>
+      </w:r>
+      <w:bookmarkStart w:id="0" w:name="_GoBack"/>
+      <w:bookmarkEnd w:id="0"/>
+      <w:r>
+        <w:rPr>
+          <w:rFonts w:ascii="Arial" w:hAnsi="Arial" w:cs="Arial"/>
+          <w:color w:val="202122"/>
+          <w:sz w:val="21"/>
+          <w:szCs w:val="21"/>
+          <w:shd w:val="clear" w:fill="FFFFFF"/>
+        </w:rPr>
+        <w:t xml:space="preserve"> a documentação online e dinâmica da API.</w:t>
       </w:r>
     </w:p>
     <w:p>
@@ -4157,7 +4157,7 @@
     <w:lsdException w:uiPriority="99" w:name="HTML Sample"/>
     <w:lsdException w:uiPriority="99" w:name="HTML Typewriter"/>
     <w:lsdException w:uiPriority="99" w:name="HTML Variable"/>
-    <w:lsdException w:uiPriority="99" w:name="Normal Table"/>
+    <w:lsdException w:qFormat="1" w:uiPriority="99" w:name="Normal Table"/>
     <w:lsdException w:uiPriority="99" w:name="annotation subject"/>
     <w:lsdException w:uiPriority="99" w:name="Table Simple 1"/>
     <w:lsdException w:uiPriority="99" w:name="Table Simple 2"/>
@@ -4237,6 +4237,7 @@
     <w:name w:val="Normal Table"/>
     <w:semiHidden/>
     <w:unhideWhenUsed/>
+    <w:qFormat/>
     <w:uiPriority w:val="99"/>
     <w:tblPr>
       <w:tblCellMar>
@@ -4285,6 +4286,7 @@
     <w:name w:val="Link da Internet"/>
     <w:basedOn w:val="2"/>
     <w:unhideWhenUsed/>
+    <w:qFormat/>
     <w:uiPriority w:val="99"/>
     <w:rPr>
       <w:color w:val="0563C1" w:themeColor="hyperlink"/>

</xml_diff>

<commit_message>
terminadas as configurações da telemetria
</commit_message>
<xml_diff>
--- a/Microservices/3SIT - 2023.01 GS (1).docx
+++ b/Microservices/3SIT - 2023.01 GS (1).docx
@@ -15,6 +15,8 @@
           <w:lang w:eastAsia="pt-BR"/>
         </w:rPr>
       </w:pPr>
+      <w:bookmarkStart w:id="0" w:name="_GoBack"/>
+      <w:bookmarkEnd w:id="0"/>
       <w:r>
         <w:rPr>
           <w:rFonts w:ascii="Arial" w:hAnsi="Arial" w:eastAsia="Times New Roman" w:cs="Arial"/>
@@ -3015,19 +3017,7 @@
           <w:szCs w:val="21"/>
           <w:shd w:val="clear" w:fill="FFFFFF"/>
         </w:rPr>
-        <w:t>A sistema deverá possuir</w:t>
-      </w:r>
-      <w:bookmarkStart w:id="0" w:name="_GoBack"/>
-      <w:bookmarkEnd w:id="0"/>
-      <w:r>
-        <w:rPr>
-          <w:rFonts w:ascii="Arial" w:hAnsi="Arial" w:cs="Arial"/>
-          <w:color w:val="202122"/>
-          <w:sz w:val="21"/>
-          <w:szCs w:val="21"/>
-          <w:shd w:val="clear" w:fill="FFFFFF"/>
-        </w:rPr>
-        <w:t xml:space="preserve"> a documentação online e dinâmica da API.</w:t>
+        <w:t>A sistema deverá possuir a documentação online e dinâmica da API.</w:t>
       </w:r>
     </w:p>
     <w:p>

</xml_diff>